<commit_message>
Add JCSSE 2026 publication, references, and update IEEE paper count to four.
Includes the new conference paper on vision-based hand-gesture input, academic references on the site and CV, and refreshed downloadable résumé files.

Co-authored-by: Cursor <cursoragent@cursor.com>
</commit_message>
<xml_diff>
--- a/assets/resume/AbrarSamin_CV.docx
+++ b/assets/resume/AbrarSamin_CV.docx
@@ -124,7 +124,7 @@
         <w:spacing w:after="60"/>
       </w:pPr>
       <w:r>
-        <w:t xml:space="preserve">Computer Science and Engineering graduate from BRAC University (CGPA 3.97/4.00) with three IEEE-published research papers in machine learning, computer vision, and explainable AI. Served as an Undergraduate Teaching Assistant for core courses including Data Structures and Algorithms, and contributed to BRAC University-funded research under the Research Seed Grant Initiative (RSGI), including AI-based assistive technology for accessibility. Strong foundation in machine learning, NLP, computer vision, and full-stack development, with a keen interest in teaching, mentoring, and advancing applied AI research in a university setting.</w:t>
+        <w:t xml:space="preserve">Computer Science and Engineering graduate from BRAC University (CGPA 3.97/4.00) with four IEEE-published research papers in machine learning, computer vision, and explainable AI. Served as an Undergraduate Teaching Assistant for core courses including Data Structures and Algorithms, and contributed to BRAC University-funded research under the Research Seed Grant Initiative (RSGI), including AI-based assistive technology for accessibility. Strong foundation in machine learning, NLP, computer vision, and full-stack development, with a keen interest in teaching, mentoring, and advancing applied AI research in a university setting.</w:t>
       </w:r>
     </w:p>
     <w:p>
@@ -361,6 +361,14 @@
       </w:r>
       <w:r>
         <w:t xml:space="preserve">, Dec. 2024, pp. 654–658.</w:t>
+      </w:r>
+    </w:p>
+    <w:p>
+      <w:pPr>
+        <w:spacing w:after="120"/>
+      </w:pPr>
+      <w:r>
+        <w:t xml:space="preserve">Sammam Mahdi, Reshad Ul Karim, Tareq Sujat, Syeda Maliha Tabassum, Abrar Samin, and Aniqua Nusrat Zereen, “Vision-based Hand Gesture Virtual Keyboard-Mouse framework with Bilingual Next-word prediction,” in Proc. 2026 23rd Int. Joint Conf. on Computer Science and Software Engineering (JCSSE), Jun. 2026, doi: 10.1109/JCSSE68839.2026.11596610.</w:t>
       </w:r>
     </w:p>
     <w:p>
@@ -770,6 +778,34 @@
       <w:pgNumType/>
       <w:docGrid w:linePitch="360"/>
     </w:sectPr>
+    <w:p>
+      <w:pPr>
+        <w:spacing w:before="240" w:after="120"/>
+      </w:pPr>
+      <w:r>
+        <w:rPr>
+          <w:b/>
+          <w:sz w:val="22"/>
+        </w:rPr>
+        <w:t>REFERENCES</w:t>
+      </w:r>
+    </w:p>
+    <w:p>
+      <w:pPr>
+        <w:spacing w:after="80"/>
+      </w:pPr>
+      <w:r>
+        <w:t xml:space="preserve">Dr. Aniqua Nusrat Zereen — Mahidol University, Thailand — aniqua.zereen@gmail.com</w:t>
+      </w:r>
+    </w:p>
+    <w:p>
+      <w:pPr>
+        <w:spacing w:after="80"/>
+      </w:pPr>
+      <w:r>
+        <w:t xml:space="preserve">Dr. Jia Uddin — Woosong University, South Korea — engrjiauddin@gmail.com</w:t>
+      </w:r>
+    </w:p>
   </w:body>
 </w:document>
 </file>

</xml_diff>